<commit_message>
Reduce las repeticiones de los seis guiones, varia el vocabulario y parafrasea la descripcion del proyecto en el video 1
</commit_message>
<xml_diff>
--- a/docs/capacitacion/guion youtube/video-1-el-problema-natural.docx
+++ b/docs/capacitacion/guion youtube/video-1-el-problema-natural.docx
@@ -74,12 +74,12 @@
     </w:p>
     <w:p>
       <w:r>
-        <w:t>En esta serie de videos les voy a platicar de lo que es el proyecto Image Bio Pro, que está impulsando la Universidad Autónoma Metropolitana para promover proyectos de inteligencia artificial en el desempeño de las funciones de docencia, investigación y preservación y difusión de la cultura, así como de vinculación y servicio a la comunidad universitaria.</w:t>
+        <w:t>En esta serie de videos les voy a platicar de Image Bio Pro, un proyecto que la Universidad Autónoma Metropolitana está impulsando para que la inteligencia artificial llegue a lo que se hace todos los días en la universidad: dar clases, investigar, preservar y difundir la cultura, y también vincularse con la comunidad y servirle.</w:t>
       </w:r>
     </w:p>
     <w:p>
       <w:r>
-        <w:t>Quizás la primera pregunta que se hagan es: ¿qué es Image Bio Pro? Bueno, básicamente es una nueva plataforma web que tiene como objetivo incorporar los nuevos conceptos de inteligencia artificial para abordar, estudiar y apoyar las actividades de docencia, de investigación y de preservación y difusión de la cultura en la comunidad universitaria de la UAM Iztapalapa. Es la nueva era de la inteligencia artificial al servicio de la comunidad universitaria.</w:t>
+        <w:t>Quizás se pregunten qué es, exactamente, Image Bio Pro. Bueno, es una plataforma web nueva, pensada para meter las ideas más recientes de la inteligencia artificial en esas mismas tareas dentro de la UAM Iztapalapa. Dicho de otro modo, es la nueva era de la inteligencia artificial puesta al servicio de la comunidad universitaria.</w:t>
       </w:r>
     </w:p>
     <w:p>
@@ -105,22 +105,22 @@
     </w:p>
     <w:p>
       <w:r>
-        <w:t>Este proyecto lo voy a presentar a lo largo de cuatro sesiones, y cada sesión se divide en videos de unos 20 minutos. Antes que nada, les platico lo que vamos a ir viendo en ellas.</w:t>
+        <w:t>Este proyecto lo voy a presentar a lo largo de cuatro sesiones. Antes que nada, les platico lo que vamos a ir viendo en ellas.</w:t>
       </w:r>
     </w:p>
     <w:p>
       <w:r>
-        <w:t>En la primera sesión vamos a ver el problema que intentamos resolver, y les platicaré las bases teóricas que ocupamos para diseñar el sitio web.</w:t>
+        <w:t>En la primera sesión empezamos por el problema que intentamos resolver, y les platicaré las bases teóricas que ocupamos para diseñar el sitio web.</w:t>
       </w:r>
     </w:p>
     <w:p>
       <w:r>
-        <w:t>En la segunda sesión vamos a ver, y lo resumo en una palabra, cómo aprende una computadora, que es la esencia de una red neuronal artificial.</w:t>
+        <w:t>En la segunda sesión, y lo resumo en una palabra, vemos cómo aprende una computadora, que es la esencia de una red neuronal artificial.</w:t>
       </w:r>
     </w:p>
     <w:p>
       <w:r>
-        <w:t>En la tercera sesión vamos a ver cómo funciona esta plataforma web. Una vez que ya entendimos el problema y exploramos las bases teóricas, ahora sí les presentaré cómo funciona el sistema.</w:t>
+        <w:t>En la tercera sesión les enseño cómo funciona esta plataforma web. Una vez que entendimos el problema y exploramos las bases teóricas, ahora sí toca mostrar el sistema.</w:t>
       </w:r>
     </w:p>
     <w:p>
@@ -161,7 +161,7 @@
     </w:p>
     <w:p>
       <w:r>
-        <w:t>Después de la imagen digital vamos a poner en orden algunas definiciones de inteligencia artificial, y con eso empezamos con las redes neuronales: qué es una neurona, qué es una capa y cómo se arma una red. El sitio funcionando lo vemos en la tercera sesión.</w:t>
+        <w:t>Después de la imagen digital vamos a poner en orden algunas definiciones de inteligencia artificial, y con eso empezamos con las redes neuronales: qué es una neurona, qué es una capa y cómo se arma una red.</w:t>
       </w:r>
     </w:p>
     <w:p>
@@ -212,17 +212,12 @@
     </w:p>
     <w:p>
       <w:r>
-        <w:t>Para quienes no han trabajado con fluorescencia, una explicación breve. En esta técnica las células se tiñen con un colorante que, al recibir cierta luz, la devuelve en otro color. Por eso la célula brilla y el fondo queda oscuro: solo vemos lo que está teñido. Y eso nos conviene, porque hay mucho contraste entre la célula y el fondo. Más adelante, cuando veamos cómo mira una imagen la computadora, esto va a cobrar mucho sentido.</w:t>
+        <w:t>Las imágenes que vamos a usar vienen de la microscopía de fluorescencia, y en un momento les explico en qué consiste.</w:t>
       </w:r>
     </w:p>
     <w:p>
       <w:r>
-        <w:t>¿Y qué preguntas se contestan con estas imágenes? Quien estudia espermatozoides puede querer saber cuántos hay en una muestra, qué tan grandes son, si ese tamaño cambia cuando cambia una condición y qué tanto varían unos de otros. Todas se contestan midiendo. Y medir a mano, uno por uno, es justo lo que se vuelve un problema.</w:t>
-      </w:r>
-    </w:p>
-    <w:p>
-      <w:r>
-        <w:t>Lo que busco con este curso es que vean cómo se aplica la inteligencia artificial a un problema real de biología de la reproducción. Entonces, eh, para entender cómo se aplica la inteligencia artificial, vamos a seguir un caso de estudio, o sea, un ejemplo concreto: contar y medir espermatozoides en imágenes de microscopio.</w:t>
+        <w:t>Lo que busco con este curso es que vean cómo se aplica la inteligencia artificial a un problema real de biología de la reproducción. Entonces, eh, para verlo en concreto, vamos a seguir un caso de estudio, o sea, un ejemplo: contar y medir espermatozoides en imágenes de microscopio.</w:t>
       </w:r>
     </w:p>
     <w:p>
@@ -232,7 +227,7 @@
     </w:p>
     <w:p>
       <w:r>
-        <w:t>La verdad es que esto importa mucho en un entorno universitario. En la docencia, una herramienta que analiza imágenes permite que quien está aprendiendo vea, con sus propios datos, cómo se pasa de una imagen a una medida. En la investigación, permite que el conteo y la medición dejen de depender de horas de trabajo manual y de la mirada de una sola persona. Y en la difusión de la cultura científica, un sitio abierto a la comunidad muestra que la inteligencia artificial es una herramienta que se puede usar, revisar y entender.</w:t>
+        <w:t>Esto tiene sentido en un entorno universitario. En la docencia, una herramienta que analiza imágenes le permite a quien está aprendiendo ver, con sus propios datos, cómo se pasa de una imagen a una medida. En la investigación, el conteo y la medición dejan de depender de horas de trabajo manual y de la mirada de una sola persona. Y en la difusión de la cultura científica, un sitio abierto a la comunidad muestra que la inteligencia artificial es una herramienta que se puede usar, revisar y entender.</w:t>
       </w:r>
     </w:p>
     <w:p>
@@ -263,7 +258,7 @@
     </w:p>
     <w:p>
       <w:r>
-        <w:t>Antes de ver el problema, una explicación breve del tipo de imágenes que vamos a usar, porque no todas vienen del mismo entorno. Trabajamos con microscopía de fluorescencia.</w:t>
+        <w:t>Veamos primero qué tipo de imágenes vamos a usar, porque no todas vienen del mismo entorno. Trabajamos con microscopía de fluorescencia.</w:t>
       </w:r>
     </w:p>
     <w:p>
@@ -273,12 +268,12 @@
     </w:p>
     <w:p>
       <w:r>
-        <w:t>El resultado es una imagen muy particular. Lo teñido brilla y lo demás queda oscuro. En nuestras imágenes las cabezas de los espermatozoides se ven rojas o anaranjadas, las colas verde amarillento y el fondo casi negro. Un contraste enorme entre lo que queremos medir y lo que no.</w:t>
+        <w:t>El resultado es una imagen muy particular. Lo teñido brilla y lo demás queda oscuro. En nuestras imágenes las cabezas de los espermatozoides se ven rojas o anaranjadas, las colas verde amarillento y el fondo casi negro.</w:t>
       </w:r>
     </w:p>
     <w:p>
       <w:r>
-        <w:t>Y eso, para la computadora, es una gran ayuda. Cuando hay mucho contraste, separar un objeto del fondo es más fácil: el objeto tiene números altos y el fondo números bajos. Ya vamos a ver qué es una imagen digital y por qué esto importa tanto.</w:t>
+        <w:t>Para la computadora esto es una gran ayuda: separar un objeto del fondo resulta más fácil cuando el objeto tiene números altos y el fondo números bajos. Más adelante vemos qué es una imagen digital y por qué esto importa tanto.</w:t>
       </w:r>
     </w:p>
     <w:p>
@@ -467,12 +462,12 @@
     </w:p>
     <w:p>
       <w:r>
-        <w:t>Nuestro sistema cuenta, mide y entrega los datos de forma consistente y revisable. No interpreta. Decidir si una diferencia es significativa, qué la causa y qué implica biológicamente le corresponde a quien conoce la biología. El sistema es un instrumento, como una balanza: da el peso, y no decide si el resultado del experimento es bueno o malo.</w:t>
+        <w:t>Nuestro sistema cuenta, mide y entrega los datos de forma uniforme y verificable. No interpreta. Decidir si una diferencia es significativa, qué la causa y qué implica biológicamente le corresponde a quien conoce la biología. El sistema es un instrumento, como una balanza: da el peso, y no decide si el resultado del experimento es bueno o malo.</w:t>
       </w:r>
     </w:p>
     <w:p>
       <w:r>
-        <w:t>Y por eso la consistencia vale tanto. Si el instrumento no es consistente, las diferencias que se encuentren podrían venir del instrumento y no de la condición. Un método de medición estable permite que lo que se vea en los datos sea lo que de verdad cambió en la muestra.</w:t>
+        <w:t>Por eso importa que el instrumento sea estable: si no lo es, las diferencias que aparezcan podrían venir del instrumento y no de la condición. Con un método de medición uniforme, lo que se ve en los datos es lo que de verdad cambió en la muestra.</w:t>
       </w:r>
     </w:p>
     <w:p>
@@ -498,27 +493,17 @@
     </w:p>
     <w:p>
       <w:r>
-        <w:t>El problema es este: contar y medir a mano es lento, es repetitivo y cambia según quién lo haga. Una sola imagen puede traer decenas o cientos de células. Muchas están encimadas o pegadas, y ahí cada persona decide distinto dónde termina una y empieza la otra. El ojo no tiene una regla fija. En la diapositiva puse tres conteos de la misma imagen, de tres personas distintas. Son números de ejemplo, no de una medición real, pero la idea es esa: tres personas cuidadosas pueden llegar a tres resultados distintos.</w:t>
+        <w:t>Ahora sí, el problema. Contar y medir a mano toma mucho tiempo, es repetitivo y el resultado cambia según quién lo haga. Una sola imagen puede traer decenas o cientos de células, y muchas están encimadas o pegadas, así que cada quien traza la frontera entre una y otra en un lugar distinto. El ojo no tiene una regla fija. En la diapositiva puse tres conteos de la misma imagen, hechos por tres personas distintas. Son números de ejemplo, no de una medición real, pero la idea es esa: tres personas cuidadosas pueden llegar a tres resultados diferentes.</w:t>
       </w:r>
     </w:p>
     <w:p>
       <w:r>
-        <w:t>Imaginen contar a mano cien células en una imagen, y luego repetirlo con muchas imágenes... este, cada persona contaría algo distinto, ¿no? Además, para la investigación muchas veces lo que importa es el tamaño: cuánto mide cada célula, cuánto varía de una a otra y cómo cambia ese tamaño entre una condición y otra. Medir cada célula a mano exige trazar su contorno con cuidado y leer el resultado, una y otra vez. Multipliquen eso por cientos de células en una imagen y por muchas imágenes. Un sistema que haga ese trabajo siempre de la misma manera deja de ser un lujo y se vuelve algo que de verdad hace falta.</w:t>
+        <w:t>Y no se trata solo de contar. Para la investigación muchas veces lo que importa es el tamaño: cuánto mide cada célula, cuánto varía de una a otra y cómo cambia entre una condición y otra. Medir a mano exige trazar cada contorno con cuidado y leer el resultado, una y otra vez, para cientos de células en muchas imágenes. Un sistema que haga ese trabajo siempre igual deja de ser un lujo y se vuelve una necesidad.</w:t>
       </w:r>
     </w:p>
     <w:p>
       <w:r>
-        <w:t>Hay otra consecuencia que a veces se pasa por alto: el cansancio. Una persona que lleva una hora contando no mide igual que cuando empezó. Un programa no se cansa, y esa regularidad vale mucho cuando se quieren comparar imágenes entre sí.</w:t>
-      </w:r>
-    </w:p>
-    <w:p>
-      <w:r>
-        <w:t>Una cosa más sobre las imágenes. Trabajamos con dos tipos: las de fluorescencia, donde las células brillan sobre un fondo oscuro, y las de fondo claro, que se ven distinto porque el fondo ya no es oscuro. Cada tipo tiene su modelo, y más adelante vamos a ver cómo el sitio elige el que corresponde.</w:t>
-      </w:r>
-    </w:p>
-    <w:p>
-      <w:r>
-        <w:t>Pensemos en dos personas que cuentan la misma imagen con todo cuidado. Una decide que dos cabezas muy pegadas son una sola, porque no ve el estrechamiento entre ellas. La otra sí lo ve y cuenta dos. Ninguna se equivocó por descuido; cada una aplicó su criterio. Pero sus números ya no coinciden, y si trabajan en laboratorios distintos, o en semanas distintas, comparar sus resultados deja de ser confiable.</w:t>
+        <w:t>Pensemos en dos personas que cuentan la misma imagen con todo cuidado. Una decide que dos cabezas muy pegadas son una sola, porque no ve el estrechamiento entre ellas. La otra sí lo ve y cuenta dos. Ninguna se equivocó por descuido; cada una aplicó su criterio. Pero sus números ya no coinciden, y comparar sus resultados deja de ser confiable.</w:t>
       </w:r>
     </w:p>
     <w:p>
@@ -533,7 +518,7 @@
     </w:p>
     <w:p>
       <w:r>
-        <w:t>Por todo eso, el objetivo es que el criterio de las personas sea consistente y repetible: que la misma imagen dé siempre el mismo resultado, y que ese resultado se pueda revisar.</w:t>
+        <w:t>Por todo eso buscamos que la misma imagen dé siempre el mismo resultado, sin importar quién la analice, y que ese resultado se pueda revisar.</w:t>
       </w:r>
     </w:p>
     <w:p>
@@ -630,17 +615,17 @@
     </w:p>
     <w:p>
       <w:r>
-        <w:t>Al final se arman los resultados: una imagen marcada con los contornos, una tabla con una fila por cabeza, una gráfica de la distribución de tamaños, un archivo CSV y un informe en PDF.</w:t>
+        <w:t>Con todo eso se arman los resultados que mencionamos: la imagen marcada con los contornos, la tabla con una fila por cabeza, la gráfica de tamaños y los archivos para descargar.</w:t>
       </w:r>
     </w:p>
     <w:p>
       <w:r>
-        <w:t>Si lo pensamos con calma, hay una parte que aprende y una parte que calcula. La que aprende es la red, y por eso necesita ejemplos y entrenamiento. La que calcula es el código, y por eso es preciso, repetible y se puede revisar.</w:t>
+        <w:t>Fíjense que hay una parte que aprende y otra que calcula. La que aprende es la red, y por eso necesita ejemplos y entrenamiento. La que calcula es el código, y por eso es preciso, repetible y fácil de comprobar.</w:t>
       </w:r>
     </w:p>
     <w:p>
       <w:r>
-        <w:t>En esta sesión nos vamos a concentrar en las piezas para entender la primera parte: qué es una imagen para una computadora, y qué es y cómo aprende una red neuronal. El recorrido completo, con el sitio funcionando, lo vemos en la tercera sesión.</w:t>
+        <w:t>De todo este mapa, hoy vemos las piezas para entender la primera parte: qué es una imagen para una computadora, y qué es una red neuronal y cómo aprende. El recorrido completo, con el sitio funcionando, llega en la tercera sesión.</w:t>
       </w:r>
     </w:p>
     <w:p>

</xml_diff>

<commit_message>
Quita el color y los diez grados de los guiones de los videos 1 y 2, porque el sistema ya no los muestra
</commit_message>
<xml_diff>
--- a/docs/capacitacion/guion youtube/video-1-el-problema-natural.docx
+++ b/docs/capacitacion/guion youtube/video-1-el-problema-natural.docx
@@ -335,7 +335,7 @@
           <w:i/>
           <w:sz w:val="20"/>
         </w:rPr>
-        <w:t>Idea central: Del problema salen cuatro cosas que medir: cuántas cabezas hay, qué tamaño tiene cada una, cómo se distribuyen los tamaños y de qué color es cada cabeza.</w:t>
+        <w:t>Idea central: Del problema salen tres cosas que medir: cuántas cabezas hay, qué tamaño tiene cada una y cómo se distribuyen los tamaños.</w:t>
       </w:r>
     </w:p>
     <w:p>
@@ -360,17 +360,12 @@
     </w:p>
     <w:p>
       <w:r>
-        <w:t>Cuarto, el color. En estas imágenes el color de la cabeza va de rojo a amarillo, y se mide con la proporción de rojo y de verde dentro de cada contorno. Y ojo: no son categorías separadas, es una escala continua, de la que usamos diez grados.</w:t>
-      </w:r>
-    </w:p>
-    <w:p>
-      <w:r>
         <w:t>Todo eso tiene que poder llevarse a otro lado. Por eso los resultados se exportan en un archivo CSV, para trabajarlos en una hoja de cálculo, y en un informe en PDF, para compartirlos.</w:t>
       </w:r>
     </w:p>
     <w:p>
       <w:r>
-        <w:t>Conteo, tamaño, distribución y color: eso es lo que el sistema entrega por cada imagen. Y todo depende de algo previo, saber dónde está cada cabeza.</w:t>
+        <w:t>Conteo, tamaño y distribución: eso es lo que el sistema entrega por cada imagen. Y todo depende de algo previo, saber dónde está cada cabeza.</w:t>
       </w:r>
     </w:p>
     <w:p>
@@ -610,7 +605,7 @@
     </w:p>
     <w:p>
       <w:r>
-        <w:t>Con los contornos en la mano, entra el código convencional. Para cada contorno cuenta los píxeles que encierra y, con la escala, los convierte en micras cuadradas: eso es el área. Mide el largo. Calcula el color a partir de la proporción de rojo y verde. Y luego junta todas las cabezas de la imagen y calcula el conteo, la media y la desviación estándar.</w:t>
+        <w:t>Con los contornos en la mano, entra el código convencional. Para cada contorno cuenta los píxeles que encierra y, con la escala, los convierte en micras cuadradas: eso es el área. Mide el largo. Y luego junta todas las cabezas de la imagen y calcula el conteo, la media y la desviación estándar.</w:t>
       </w:r>
     </w:p>
     <w:p>

</xml_diff>

<commit_message>
Cambia sesion por modulo en los guiones y arma el modulo 1 en tres videos con el plan de unos diez videos
</commit_message>
<xml_diff>
--- a/docs/capacitacion/guion youtube/video-1-el-problema-natural.docx
+++ b/docs/capacitacion/guion youtube/video-1-el-problema-natural.docx
@@ -12,7 +12,7 @@
     </w:p>
     <w:p>
       <w:r>
-        <w:t>Image Bio Pro · Sesión 1 · Capacitación en video</w:t>
+        <w:t>Image Bio Pro · Módulo 1 · Capacitación en video</w:t>
       </w:r>
     </w:p>
     <w:p>
@@ -88,7 +88,7 @@
           <w:b/>
           <w:color w:val="1F4E9A"/>
         </w:rPr>
-        <w:t>[Diapositiva · Las cuatro sesiones]</w:t>
+        <w:t>[Diapositiva · Los cuatro módulos]</w:t>
       </w:r>
     </w:p>
     <w:p>
@@ -100,37 +100,37 @@
           <w:i/>
           <w:sz w:val="20"/>
         </w:rPr>
-        <w:t>Idea central: Son cuatro sesiones: la primera el problema y las bases teóricas, la segunda cómo aprende una computadora, la tercera el sitio funcionando y la cuarta datos, entrenamiento y despliegue.</w:t>
+        <w:t>Idea central: Son cuatro módulos: el primero el problema y las bases teóricas, el segundo cómo aprende una computadora, el tercero el sitio funcionando y el cuarto datos, entrenamiento y despliegue.</w:t>
       </w:r>
     </w:p>
     <w:p>
       <w:r>
-        <w:t>Este proyecto lo voy a presentar a lo largo de cuatro sesiones. Antes que nada, les platico lo que vamos a ir viendo en ellas.</w:t>
+        <w:t>Este proyecto lo voy a presentar a lo largo de cuatro módulos. Antes que nada, les platico lo que vamos a ir viendo en ellos.</w:t>
       </w:r>
     </w:p>
     <w:p>
       <w:r>
-        <w:t>En la primera sesión empezamos por el problema que intentamos resolver, y les platicaré las bases teóricas que ocupamos para diseñar el sitio web.</w:t>
+        <w:t>En el primer módulo empezamos por el problema que intentamos resolver, y les platicaré las bases teóricas que ocupamos para diseñar el sitio web.</w:t>
       </w:r>
     </w:p>
     <w:p>
       <w:r>
-        <w:t>En la segunda sesión, y lo resumo en una palabra, vemos cómo aprende una computadora, que es la esencia de una red neuronal artificial.</w:t>
+        <w:t>En el segundo módulo, y lo resumo en una palabra, vemos cómo aprende una computadora, que es la esencia de una red neuronal artificial.</w:t>
       </w:r>
     </w:p>
     <w:p>
       <w:r>
-        <w:t>En la tercera sesión les enseño cómo funciona esta plataforma web. Una vez que entendimos el problema y exploramos las bases teóricas, ahora sí toca mostrar el sistema.</w:t>
+        <w:t>En el tercer módulo les enseño cómo funciona esta plataforma web. Una vez que entendimos el problema y exploramos las bases teóricas, ahora sí toca mostrar el sistema.</w:t>
       </w:r>
     </w:p>
     <w:p>
       <w:r>
-        <w:t>Y en la cuarta sesión veremos un par de ejemplos con datos, cómo se entrena la red neuronal y cómo es el despliegue de la información.</w:t>
+        <w:t>Y en el cuarto módulo veremos un par de ejemplos con datos, cómo se entrena la red neuronal y cómo es el despliegue de la información.</w:t>
       </w:r>
     </w:p>
     <w:p>
       <w:r>
-        <w:t>Quisiera pedirles que me den la oportunidad de cautivarlos para poder presentarles el sitio web en la tercera sesión. Me gustaría que primero tuvieran todo el background, todas las bases teóricas que nos permitieron desarrollar este sitio, para que cuando lo visiten sepan el trabajo y el enfoque de inteligencia artificial que utilizó esta plataforma. Espero que me puedan acompañar en estas cuatro sesiones.</w:t>
+        <w:t>Quisiera pedirles que me den la oportunidad de cautivarlos para poder presentarles el sitio web en el tercer módulo. Me gustaría que primero tuvieran todo el background, todas las bases teóricas que nos permitieron desarrollar este sitio, para que cuando lo visiten sepan el trabajo y el enfoque de inteligencia artificial que utilizó esta plataforma. Espero que me puedan acompañar en estos cuatro módulos.</w:t>
       </w:r>
     </w:p>
     <w:p>
@@ -139,7 +139,7 @@
           <w:b/>
           <w:color w:val="1F4E9A"/>
         </w:rPr>
-        <w:t>[Diapositiva · La agenda de esta sesión]</w:t>
+        <w:t>[Diapositiva · La agenda de este módulo]</w:t>
       </w:r>
     </w:p>
     <w:p>
@@ -151,12 +151,12 @@
           <w:i/>
           <w:sz w:val="20"/>
         </w:rPr>
-        <w:t>Idea central: En esta sesión: el problema, qué es una imagen digital, algunas definiciones de inteligencia artificial y el comienzo de las redes neuronales. El sitio funcionando se presenta en la tercera sesión.</w:t>
+        <w:t>Idea central: En este módulo: el problema, qué es una imagen digital, algunas definiciones de inteligencia artificial y el comienzo de las redes neuronales. El sitio funcionando se presenta en el tercer módulo.</w:t>
       </w:r>
     </w:p>
     <w:p>
       <w:r>
-        <w:t>La agenda de esta primera sesión: primero quisiera presentarles el problema, y después comenzamos explicando qué es una imagen digital.</w:t>
+        <w:t>La agenda de este primer módulo: primero quisiera presentarles el problema, y después comenzamos explicando qué es una imagen digital.</w:t>
       </w:r>
     </w:p>
     <w:p>
@@ -166,7 +166,7 @@
     </w:p>
     <w:p>
       <w:r>
-        <w:t>Cada sesión se divide en videos de unos 20 minutos. Esta primera sesión son seis videos, y en cada uno vamos a ir avanzando por estos temas.</w:t>
+        <w:t>Cada módulo se divide en videos de unos 20 minutos. Este primer módulo son seis videos, y en cada uno vamos a ir avanzando por estos temas.</w:t>
       </w:r>
     </w:p>
     <w:p>
@@ -202,7 +202,7 @@
     </w:p>
     <w:p>
       <w:r>
-        <w:t>Entonces se hace otra cosa. Se le muestran a la computadora muchos ejemplos ya resueltos: imágenes donde una persona marcó a mano dónde están los espermatozoides. El programa ajusta por sí mismo lo que necesita para reproducir esas marcas. A eso se le llama aprender de ejemplos, y a lo que resulta de ese proceso se le llama modelo. Cómo sucede ese ajuste lo vemos con calma más adelante en esta sesión. Por ahora basta con recordar que al modelo le dimos ejemplos en lugar de reglas.</w:t>
+        <w:t>Entonces se hace otra cosa. Se le muestran a la computadora muchos ejemplos ya resueltos: imágenes donde una persona marcó a mano dónde están los espermatozoides. El programa ajusta por sí mismo lo que necesita para reproducir esas marcas. A eso se le llama aprender de ejemplos, y a lo que resulta de ese proceso se le llama modelo. Cómo sucede ese ajuste lo vemos con calma más adelante en este módulo. Por ahora basta con recordar que al modelo le dimos ejemplos en lugar de reglas.</w:t>
       </w:r>
     </w:p>
     <w:p>
@@ -232,7 +232,7 @@
     </w:p>
     <w:p>
       <w:r>
-        <w:t>Por eso, a lo largo de las sesiones vamos a ver el sitio funcionando y también las ideas que hay debajo. Así cualquiera de ustedes puede razonar sobre qué hace el sistema, cuándo confiar en él y cuándo mirar con más cuidado. Esa es la ventaja de conocer las bases: dejan de ser una caja negra.</w:t>
+        <w:t>Por eso, a lo largo de los módulos vamos a ver el sitio funcionando y también las ideas que hay debajo. Así cualquiera de ustedes puede razonar sobre qué hace el sistema, cuándo confiar en él y cuándo mirar con más cuidado. Esa es la ventaja de conocer las bases: dejan de ser una caja negra.</w:t>
       </w:r>
     </w:p>
     <w:p>
@@ -620,7 +620,7 @@
     </w:p>
     <w:p>
       <w:r>
-        <w:t>De todo este mapa, hoy vemos las piezas para entender la primera parte: qué es una imagen para una computadora, y qué es una red neuronal y cómo aprende. El recorrido completo, con el sitio funcionando, llega en la tercera sesión.</w:t>
+        <w:t>De todo este mapa, hoy vemos las piezas para entender la primera parte: qué es una imagen para una computadora, y qué es una red neuronal y cómo aprende. El recorrido completo, con el sitio funcionando, llega en el tercer módulo.</w:t>
       </w:r>
     </w:p>
     <w:p>

</xml_diff>